<commit_message>
feat: customer final dashboard updation
</commit_message>
<xml_diff>
--- a/OUTPUT SCREENS.docx
+++ b/OUTPUT SCREENS.docx
@@ -2020,8 +2020,6 @@
           </wp:inline>
         </w:drawing>
       </w:r>
-      <w:bookmarkStart w:id="0" w:name="_GoBack"/>
-      <w:bookmarkEnd w:id="0"/>
     </w:p>
     <w:p>
       <w:pPr>
@@ -2104,9 +2102,9 @@
         </w:rPr>
         <w:drawing>
           <wp:inline distT="0" distB="0" distL="114300" distR="114300">
-            <wp:extent cx="5273040" cy="3776345"/>
-            <wp:effectExtent l="0" t="0" r="3810" b="14605"/>
-            <wp:docPr id="23" name="Picture 23" descr="Screenshot 2026-08-20 133633"/>
+            <wp:extent cx="5267325" cy="2921000"/>
+            <wp:effectExtent l="0" t="0" r="9525" b="12700"/>
+            <wp:docPr id="33" name="Picture 33" descr="Screenshot 2026-08-21 164454"/>
             <wp:cNvGraphicFramePr>
               <a:graphicFrameLocks xmlns:a="http://schemas.openxmlformats.org/drawingml/2006/main" noChangeAspect="1"/>
             </wp:cNvGraphicFramePr>
@@ -2114,7 +2112,7 @@
               <a:graphicData uri="http://schemas.openxmlformats.org/drawingml/2006/picture">
                 <pic:pic xmlns:pic="http://schemas.openxmlformats.org/drawingml/2006/picture">
                   <pic:nvPicPr>
-                    <pic:cNvPr id="23" name="Picture 23" descr="Screenshot 2026-08-20 133633"/>
+                    <pic:cNvPr id="33" name="Picture 33" descr="Screenshot 2026-08-21 164454"/>
                     <pic:cNvPicPr>
                       <a:picLocks noChangeAspect="1"/>
                     </pic:cNvPicPr>
@@ -2128,7 +2126,7 @@
                   <pic:spPr>
                     <a:xfrm>
                       <a:off x="0" y="0"/>
-                      <a:ext cx="5273040" cy="3776345"/>
+                      <a:ext cx="5267325" cy="2921000"/>
                     </a:xfrm>
                     <a:prstGeom prst="rect">
                       <a:avLst/>
@@ -2140,53 +2138,54 @@
           </wp:inline>
         </w:drawing>
       </w:r>
-      <w:r>
-        <w:rPr>
-          <w:rFonts w:hint="default"/>
-          <w:b/>
-          <w:bCs/>
-          <w:sz w:val="40"/>
-          <w:szCs w:val="40"/>
-          <w:lang w:val="en-GB"/>
-        </w:rPr>
-        <w:drawing>
-          <wp:inline distT="0" distB="0" distL="114300" distR="114300">
-            <wp:extent cx="5267325" cy="3724275"/>
-            <wp:effectExtent l="0" t="0" r="9525" b="9525"/>
-            <wp:docPr id="24" name="Picture 24" descr="Screenshot 2026-08-20 133655"/>
-            <wp:cNvGraphicFramePr>
-              <a:graphicFrameLocks xmlns:a="http://schemas.openxmlformats.org/drawingml/2006/main" noChangeAspect="1"/>
-            </wp:cNvGraphicFramePr>
-            <a:graphic xmlns:a="http://schemas.openxmlformats.org/drawingml/2006/main">
-              <a:graphicData uri="http://schemas.openxmlformats.org/drawingml/2006/picture">
-                <pic:pic xmlns:pic="http://schemas.openxmlformats.org/drawingml/2006/picture">
-                  <pic:nvPicPr>
-                    <pic:cNvPr id="24" name="Picture 24" descr="Screenshot 2026-08-20 133655"/>
-                    <pic:cNvPicPr>
-                      <a:picLocks noChangeAspect="1"/>
-                    </pic:cNvPicPr>
-                  </pic:nvPicPr>
-                  <pic:blipFill>
-                    <a:blip r:embed="rId28"/>
-                    <a:stretch>
-                      <a:fillRect/>
-                    </a:stretch>
-                  </pic:blipFill>
-                  <pic:spPr>
-                    <a:xfrm>
-                      <a:off x="0" y="0"/>
-                      <a:ext cx="5267325" cy="3724275"/>
-                    </a:xfrm>
-                    <a:prstGeom prst="rect">
-                      <a:avLst/>
-                    </a:prstGeom>
-                  </pic:spPr>
-                </pic:pic>
-              </a:graphicData>
-            </a:graphic>
-          </wp:inline>
-        </w:drawing>
-      </w:r>
+    </w:p>
+    <w:p>
+      <w:pPr>
+        <w:rPr>
+          <w:rFonts w:hint="default"/>
+          <w:b/>
+          <w:bCs/>
+          <w:sz w:val="40"/>
+          <w:szCs w:val="40"/>
+          <w:lang w:val="en-GB"/>
+        </w:rPr>
+      </w:pPr>
+    </w:p>
+    <w:p>
+      <w:pPr>
+        <w:rPr>
+          <w:rFonts w:hint="default"/>
+          <w:b/>
+          <w:bCs/>
+          <w:sz w:val="40"/>
+          <w:szCs w:val="40"/>
+          <w:lang w:val="en-GB"/>
+        </w:rPr>
+      </w:pPr>
+    </w:p>
+    <w:p>
+      <w:pPr>
+        <w:rPr>
+          <w:rFonts w:hint="default"/>
+          <w:b/>
+          <w:bCs/>
+          <w:sz w:val="40"/>
+          <w:szCs w:val="40"/>
+          <w:lang w:val="en-GB"/>
+        </w:rPr>
+      </w:pPr>
+    </w:p>
+    <w:p>
+      <w:pPr>
+        <w:rPr>
+          <w:rFonts w:hint="default"/>
+          <w:b/>
+          <w:bCs/>
+          <w:sz w:val="40"/>
+          <w:szCs w:val="40"/>
+          <w:lang w:val="en-GB"/>
+        </w:rPr>
+      </w:pPr>
     </w:p>
     <w:p>
       <w:pPr>
@@ -2297,7 +2296,7 @@
                     </pic:cNvPicPr>
                   </pic:nvPicPr>
                   <pic:blipFill>
-                    <a:blip r:embed="rId29"/>
+                    <a:blip r:embed="rId28"/>
                     <a:stretch>
                       <a:fillRect/>
                     </a:stretch>
@@ -2344,7 +2343,7 @@
                     </pic:cNvPicPr>
                   </pic:nvPicPr>
                   <pic:blipFill>
-                    <a:blip r:embed="rId30"/>
+                    <a:blip r:embed="rId29"/>
                     <a:stretch>
                       <a:fillRect/>
                     </a:stretch>
@@ -2364,6 +2363,42 @@
           </wp:inline>
         </w:drawing>
       </w:r>
+    </w:p>
+    <w:p>
+      <w:pPr>
+        <w:rPr>
+          <w:rFonts w:hint="default"/>
+          <w:b/>
+          <w:bCs/>
+          <w:sz w:val="40"/>
+          <w:szCs w:val="40"/>
+          <w:lang w:val="en-GB"/>
+        </w:rPr>
+      </w:pPr>
+    </w:p>
+    <w:p>
+      <w:pPr>
+        <w:rPr>
+          <w:rFonts w:hint="default"/>
+          <w:b/>
+          <w:bCs/>
+          <w:sz w:val="40"/>
+          <w:szCs w:val="40"/>
+          <w:lang w:val="en-GB"/>
+        </w:rPr>
+      </w:pPr>
+    </w:p>
+    <w:p>
+      <w:pPr>
+        <w:rPr>
+          <w:rFonts w:hint="default"/>
+          <w:b/>
+          <w:bCs/>
+          <w:sz w:val="40"/>
+          <w:szCs w:val="40"/>
+          <w:lang w:val="en-GB"/>
+        </w:rPr>
+      </w:pPr>
       <w:r>
         <w:rPr>
           <w:rFonts w:hint="default"/>
@@ -2375,9 +2410,9 @@
         </w:rPr>
         <w:drawing>
           <wp:inline distT="0" distB="0" distL="114300" distR="114300">
-            <wp:extent cx="5272405" cy="4516120"/>
-            <wp:effectExtent l="0" t="0" r="4445" b="17780"/>
-            <wp:docPr id="27" name="Picture 27" descr="Screenshot 2026-08-20 125608"/>
+            <wp:extent cx="5268595" cy="4231005"/>
+            <wp:effectExtent l="0" t="0" r="8255" b="17145"/>
+            <wp:docPr id="34" name="Picture 34" descr="Screenshot 2026-08-21 163203"/>
             <wp:cNvGraphicFramePr>
               <a:graphicFrameLocks xmlns:a="http://schemas.openxmlformats.org/drawingml/2006/main" noChangeAspect="1"/>
             </wp:cNvGraphicFramePr>
@@ -2385,7 +2420,92 @@
               <a:graphicData uri="http://schemas.openxmlformats.org/drawingml/2006/picture">
                 <pic:pic xmlns:pic="http://schemas.openxmlformats.org/drawingml/2006/picture">
                   <pic:nvPicPr>
-                    <pic:cNvPr id="27" name="Picture 27" descr="Screenshot 2026-08-20 125608"/>
+                    <pic:cNvPr id="34" name="Picture 34" descr="Screenshot 2026-08-21 163203"/>
+                    <pic:cNvPicPr>
+                      <a:picLocks noChangeAspect="1"/>
+                    </pic:cNvPicPr>
+                  </pic:nvPicPr>
+                  <pic:blipFill>
+                    <a:blip r:embed="rId30"/>
+                    <a:stretch>
+                      <a:fillRect/>
+                    </a:stretch>
+                  </pic:blipFill>
+                  <pic:spPr>
+                    <a:xfrm>
+                      <a:off x="0" y="0"/>
+                      <a:ext cx="5268595" cy="4231005"/>
+                    </a:xfrm>
+                    <a:prstGeom prst="rect">
+                      <a:avLst/>
+                    </a:prstGeom>
+                  </pic:spPr>
+                </pic:pic>
+              </a:graphicData>
+            </a:graphic>
+          </wp:inline>
+        </w:drawing>
+      </w:r>
+      <w:bookmarkStart w:id="0" w:name="_GoBack"/>
+      <w:bookmarkEnd w:id="0"/>
+    </w:p>
+    <w:p>
+      <w:pPr>
+        <w:rPr>
+          <w:rFonts w:hint="default"/>
+          <w:b/>
+          <w:bCs/>
+          <w:sz w:val="40"/>
+          <w:szCs w:val="40"/>
+          <w:lang w:val="en-GB"/>
+        </w:rPr>
+      </w:pPr>
+    </w:p>
+    <w:p>
+      <w:pPr>
+        <w:rPr>
+          <w:rFonts w:hint="default"/>
+          <w:b/>
+          <w:bCs/>
+          <w:sz w:val="40"/>
+          <w:szCs w:val="40"/>
+          <w:lang w:val="en-GB"/>
+        </w:rPr>
+      </w:pPr>
+    </w:p>
+    <w:p>
+      <w:pPr>
+        <w:rPr>
+          <w:rFonts w:hint="default"/>
+          <w:b/>
+          <w:bCs/>
+          <w:sz w:val="40"/>
+          <w:szCs w:val="40"/>
+          <w:lang w:val="en-GB"/>
+        </w:rPr>
+      </w:pPr>
+      <w:r>
+        <w:rPr>
+          <w:rFonts w:hint="default"/>
+          <w:b/>
+          <w:bCs/>
+          <w:sz w:val="40"/>
+          <w:szCs w:val="40"/>
+          <w:lang w:val="en-GB"/>
+        </w:rPr>
+        <w:drawing>
+          <wp:inline distT="0" distB="0" distL="114300" distR="114300">
+            <wp:extent cx="5274310" cy="4070985"/>
+            <wp:effectExtent l="0" t="0" r="2540" b="5715"/>
+            <wp:docPr id="32" name="Picture 32" descr="Screenshot 2026-08-21 163230"/>
+            <wp:cNvGraphicFramePr>
+              <a:graphicFrameLocks xmlns:a="http://schemas.openxmlformats.org/drawingml/2006/main" noChangeAspect="1"/>
+            </wp:cNvGraphicFramePr>
+            <a:graphic xmlns:a="http://schemas.openxmlformats.org/drawingml/2006/main">
+              <a:graphicData uri="http://schemas.openxmlformats.org/drawingml/2006/picture">
+                <pic:pic xmlns:pic="http://schemas.openxmlformats.org/drawingml/2006/picture">
+                  <pic:nvPicPr>
+                    <pic:cNvPr id="32" name="Picture 32" descr="Screenshot 2026-08-21 163230"/>
                     <pic:cNvPicPr>
                       <a:picLocks noChangeAspect="1"/>
                     </pic:cNvPicPr>
@@ -2399,7 +2519,7 @@
                   <pic:spPr>
                     <a:xfrm>
                       <a:off x="0" y="0"/>
-                      <a:ext cx="5272405" cy="4516120"/>
+                      <a:ext cx="5274310" cy="4070985"/>
                     </a:xfrm>
                     <a:prstGeom prst="rect">
                       <a:avLst/>
@@ -2411,53 +2531,42 @@
           </wp:inline>
         </w:drawing>
       </w:r>
-      <w:r>
-        <w:rPr>
-          <w:rFonts w:hint="default"/>
-          <w:b/>
-          <w:bCs/>
-          <w:sz w:val="40"/>
-          <w:szCs w:val="40"/>
-          <w:lang w:val="en-GB"/>
-        </w:rPr>
-        <w:drawing>
-          <wp:inline distT="0" distB="0" distL="114300" distR="114300">
-            <wp:extent cx="5269230" cy="2510155"/>
-            <wp:effectExtent l="0" t="0" r="7620" b="4445"/>
-            <wp:docPr id="28" name="Picture 28" descr="Screenshot 2026-08-20 125659"/>
-            <wp:cNvGraphicFramePr>
-              <a:graphicFrameLocks xmlns:a="http://schemas.openxmlformats.org/drawingml/2006/main" noChangeAspect="1"/>
-            </wp:cNvGraphicFramePr>
-            <a:graphic xmlns:a="http://schemas.openxmlformats.org/drawingml/2006/main">
-              <a:graphicData uri="http://schemas.openxmlformats.org/drawingml/2006/picture">
-                <pic:pic xmlns:pic="http://schemas.openxmlformats.org/drawingml/2006/picture">
-                  <pic:nvPicPr>
-                    <pic:cNvPr id="28" name="Picture 28" descr="Screenshot 2026-08-20 125659"/>
-                    <pic:cNvPicPr>
-                      <a:picLocks noChangeAspect="1"/>
-                    </pic:cNvPicPr>
-                  </pic:nvPicPr>
-                  <pic:blipFill>
-                    <a:blip r:embed="rId32"/>
-                    <a:stretch>
-                      <a:fillRect/>
-                    </a:stretch>
-                  </pic:blipFill>
-                  <pic:spPr>
-                    <a:xfrm>
-                      <a:off x="0" y="0"/>
-                      <a:ext cx="5269230" cy="2510155"/>
-                    </a:xfrm>
-                    <a:prstGeom prst="rect">
-                      <a:avLst/>
-                    </a:prstGeom>
-                  </pic:spPr>
-                </pic:pic>
-              </a:graphicData>
-            </a:graphic>
-          </wp:inline>
-        </w:drawing>
-      </w:r>
+    </w:p>
+    <w:p>
+      <w:pPr>
+        <w:rPr>
+          <w:rFonts w:hint="default"/>
+          <w:b/>
+          <w:bCs/>
+          <w:sz w:val="40"/>
+          <w:szCs w:val="40"/>
+          <w:lang w:val="en-GB"/>
+        </w:rPr>
+      </w:pPr>
+    </w:p>
+    <w:p>
+      <w:pPr>
+        <w:rPr>
+          <w:rFonts w:hint="default"/>
+          <w:b/>
+          <w:bCs/>
+          <w:sz w:val="40"/>
+          <w:szCs w:val="40"/>
+          <w:lang w:val="en-GB"/>
+        </w:rPr>
+      </w:pPr>
+    </w:p>
+    <w:p>
+      <w:pPr>
+        <w:rPr>
+          <w:rFonts w:hint="default"/>
+          <w:b/>
+          <w:bCs/>
+          <w:sz w:val="40"/>
+          <w:szCs w:val="40"/>
+          <w:lang w:val="en-GB"/>
+        </w:rPr>
+      </w:pPr>
       <w:r>
         <w:rPr>
           <w:rFonts w:hint="default"/>
@@ -2485,7 +2594,7 @@
                     </pic:cNvPicPr>
                   </pic:nvPicPr>
                   <pic:blipFill>
-                    <a:blip r:embed="rId33"/>
+                    <a:blip r:embed="rId32"/>
                     <a:stretch>
                       <a:fillRect/>
                     </a:stretch>
@@ -2589,184 +2698,16 @@
           <w:lang w:val="en-GB"/>
         </w:rPr>
       </w:pPr>
-    </w:p>
-    <w:p>
-      <w:pPr>
-        <w:rPr>
-          <w:rFonts w:hint="default"/>
-          <w:b/>
-          <w:bCs/>
-          <w:sz w:val="40"/>
-          <w:szCs w:val="40"/>
-          <w:lang w:val="en-GB"/>
-        </w:rPr>
-      </w:pPr>
-    </w:p>
-    <w:p>
-      <w:pPr>
-        <w:rPr>
-          <w:rFonts w:hint="default"/>
-          <w:b/>
-          <w:bCs/>
-          <w:sz w:val="40"/>
-          <w:szCs w:val="40"/>
-          <w:lang w:val="en-GB"/>
-        </w:rPr>
-      </w:pPr>
-    </w:p>
-    <w:p>
-      <w:pPr>
-        <w:rPr>
-          <w:rFonts w:hint="default"/>
-          <w:b/>
-          <w:bCs/>
-          <w:sz w:val="40"/>
-          <w:szCs w:val="40"/>
-          <w:lang w:val="en-GB"/>
-        </w:rPr>
-      </w:pPr>
-    </w:p>
-    <w:p>
-      <w:pPr>
-        <w:rPr>
-          <w:rFonts w:hint="default"/>
-          <w:b/>
-          <w:bCs/>
-          <w:sz w:val="40"/>
-          <w:szCs w:val="40"/>
-          <w:lang w:val="en-GB"/>
-        </w:rPr>
-      </w:pPr>
-    </w:p>
-    <w:p>
-      <w:pPr>
-        <w:rPr>
-          <w:rFonts w:hint="default"/>
-          <w:b/>
-          <w:bCs/>
-          <w:sz w:val="40"/>
-          <w:szCs w:val="40"/>
-          <w:lang w:val="en-GB"/>
-        </w:rPr>
-      </w:pPr>
-    </w:p>
-    <w:p>
-      <w:pPr>
-        <w:rPr>
-          <w:rFonts w:hint="default"/>
-          <w:b/>
-          <w:bCs/>
-          <w:sz w:val="40"/>
-          <w:szCs w:val="40"/>
-          <w:lang w:val="en-GB"/>
-        </w:rPr>
-      </w:pPr>
-    </w:p>
-    <w:p>
-      <w:pPr>
-        <w:rPr>
-          <w:rFonts w:hint="default"/>
-          <w:b/>
-          <w:bCs/>
-          <w:sz w:val="40"/>
-          <w:szCs w:val="40"/>
-          <w:lang w:val="en-GB"/>
-        </w:rPr>
-      </w:pPr>
-    </w:p>
-    <w:p>
-      <w:pPr>
-        <w:rPr>
-          <w:rFonts w:hint="default"/>
-          <w:b/>
-          <w:bCs/>
-          <w:sz w:val="40"/>
-          <w:szCs w:val="40"/>
-          <w:lang w:val="en-GB"/>
-        </w:rPr>
-      </w:pPr>
-    </w:p>
-    <w:p>
-      <w:pPr>
-        <w:rPr>
-          <w:rFonts w:hint="default"/>
-          <w:b/>
-          <w:bCs/>
-          <w:sz w:val="40"/>
-          <w:szCs w:val="40"/>
-          <w:lang w:val="en-GB"/>
-        </w:rPr>
-      </w:pPr>
-    </w:p>
-    <w:p>
-      <w:pPr>
-        <w:rPr>
-          <w:rFonts w:hint="default"/>
-          <w:b/>
-          <w:bCs/>
-          <w:sz w:val="40"/>
-          <w:szCs w:val="40"/>
-          <w:lang w:val="en-GB"/>
-        </w:rPr>
-      </w:pPr>
-    </w:p>
-    <w:p>
-      <w:pPr>
-        <w:rPr>
-          <w:rFonts w:hint="default"/>
-          <w:b/>
-          <w:bCs/>
-          <w:sz w:val="40"/>
-          <w:szCs w:val="40"/>
-          <w:lang w:val="en-GB"/>
-        </w:rPr>
-      </w:pPr>
-    </w:p>
-    <w:p>
-      <w:pPr>
-        <w:rPr>
-          <w:rFonts w:hint="default"/>
-          <w:b/>
-          <w:bCs/>
-          <w:sz w:val="40"/>
-          <w:szCs w:val="40"/>
-          <w:lang w:val="en-GB"/>
-        </w:rPr>
-      </w:pPr>
-    </w:p>
-    <w:p>
-      <w:pPr>
-        <w:rPr>
-          <w:rFonts w:hint="default"/>
-          <w:b/>
-          <w:bCs/>
-          <w:sz w:val="40"/>
-          <w:szCs w:val="40"/>
-          <w:lang w:val="en-GB"/>
-        </w:rPr>
-      </w:pPr>
-    </w:p>
-    <w:p>
-      <w:pPr>
-        <w:rPr>
-          <w:rFonts w:hint="default"/>
-          <w:b/>
-          <w:bCs/>
-          <w:sz w:val="40"/>
-          <w:szCs w:val="40"/>
-          <w:lang w:val="en-GB"/>
-        </w:rPr>
-      </w:pPr>
-      <w:r>
-        <w:rPr>
-          <w:rFonts w:hint="default"/>
-          <w:b/>
-          <w:bCs/>
-          <w:sz w:val="40"/>
-          <w:szCs w:val="40"/>
-          <w:lang w:val="en-GB"/>
-        </w:rPr>
-        <w:t>MOBILE RESPONSIVENES</w:t>
+      <w:r>
+        <w:rPr>
+          <w:rFonts w:hint="default"/>
+          <w:b/>
+          <w:bCs/>
+          <w:sz w:val="40"/>
+          <w:szCs w:val="40"/>
+          <w:lang w:val="en-GB"/>
+        </w:rPr>
+        <w:t>MOBILE RESPONSIVENES:</w:t>
       </w:r>
       <w:r>
         <w:rPr>
@@ -2795,7 +2736,7 @@
                     </pic:cNvPicPr>
                   </pic:nvPicPr>
                   <pic:blipFill>
-                    <a:blip r:embed="rId34"/>
+                    <a:blip r:embed="rId33"/>
                     <a:stretch>
                       <a:fillRect/>
                     </a:stretch>

</xml_diff>